<commit_message>
refactor: modularize monolithic backend into structured application packages and services
</commit_message>
<xml_diff>
--- a/test_conversions/test_document_converted.docx
+++ b/test_conversions/test_document_converted.docx
@@ -4,7 +4,17 @@
   <w:body>
     <w:p>
       <w:r>
-        <w:t>This is a test document.\nIt has multiple lines.\nFor conversion testing.</w:t>
+        <w:t>This is a test document.</w:t>
+      </w:r>
+    </w:p>
+    <w:p>
+      <w:r>
+        <w:t>It has multiple lines.</w:t>
+      </w:r>
+    </w:p>
+    <w:p>
+      <w:r>
+        <w:t>For conversion testing.</w:t>
       </w:r>
     </w:p>
     <w:sectPr>

</xml_diff>